<commit_message>
Ajusta análisis a la rúbrica: diversidad global, migración como causa y valoración positiva
Co-Authored-By: Claude Sonnet 5.5 <noreply@anthropic.com>
Claude-Session: https://claude.ai/code/session_01DzwH1hiCGYH6vqyUvXdTX6
</commit_message>
<xml_diff>
--- a/Analisis_La_Revolucion_y_la_Tierra.docx
+++ b/Analisis_La_Revolucion_y_la_Tierra.docx
@@ -77,7 +77,7 @@
           <w:sz w:val="20"/>
           <w:szCs w:val="20"/>
         </w:rPr>
-        <w:t xml:space="preserve"> muestra cómo el orden colonial y la hacienda sostuvieron durante siglos la exclusión de la población indígena, y cómo las rebeliones campesinas de los años sesenta y la reforma agraria intentaron desmontarla. Este trabajo parte de esa mirada para examinar un proceso posterior y menos visible: la migración del campo a la ciudad, sus efectos en la identidad cultural de los migrantes andinos (idioma, costumbres) y la discriminación que enfrentaron en Lima, que en buena medida persiste hoy. Al final se presentan una reflexión personal y propuestas para construir espacios interculturales en la educación superior y el trabajo.</w:t>
+        <w:t xml:space="preserve"> muestra cómo el orden colonial y la hacienda sostuvieron durante siglos la exclusión de la población indígena, y cómo las rebeliones campesinas de los años sesenta y la reforma agraria intentaron desmontarla. Este trabajo parte de esa mirada para examinar un proceso posterior y menos visible: la migración del campo a la ciudad, sus efectos en la identidad cultural de los migrantes andinos (idioma, costumbres) y la discriminación que enfrentaron en Lima, que en buena medida persiste hoy. Se cierra con una reflexión personal y propuestas interculturales para la educación superior y el trabajo.</w:t>
       </w:r>
     </w:p>
     <w:p>
@@ -109,15 +109,33 @@
           <w:sz w:val="20"/>
           <w:szCs w:val="20"/>
         </w:rPr>
-        <w:t xml:space="preserve">Diversidad:</w:t>
-      </w:r>
-      <w:r>
-        <w:rPr>
-          <w:rFonts w:ascii="Times New Roman" w:cs="Times New Roman" w:eastAsia="Times New Roman" w:hAnsi="Times New Roman"/>
-          <w:sz w:val="20"/>
-          <w:szCs w:val="20"/>
-        </w:rPr>
-        <w:t xml:space="preserve"> coexistencia de pueblos, lenguas, saberes y formas de vida distintas dentro de una misma sociedad (UNESCO, 2001). </w:t>
+        <w:t xml:space="preserve">Diversidad cultural:</w:t>
+      </w:r>
+      <w:r>
+        <w:rPr>
+          <w:rFonts w:ascii="Times New Roman" w:cs="Times New Roman" w:eastAsia="Times New Roman" w:hAnsi="Times New Roman"/>
+          <w:sz w:val="20"/>
+          <w:szCs w:val="20"/>
+        </w:rPr>
+        <w:t xml:space="preserve"> coexistencia de pueblos, lenguas, saberes y formas de vida distintas dentro de una sociedad (UNESCO, 2001); </w:t>
+      </w:r>
+      <w:r>
+        <w:rPr>
+          <w:rFonts w:ascii="Times New Roman" w:cs="Times New Roman" w:eastAsia="Times New Roman" w:hAnsi="Times New Roman"/>
+          <w:b/>
+          <w:bCs/>
+          <w:sz w:val="20"/>
+          <w:szCs w:val="20"/>
+        </w:rPr>
+        <w:t xml:space="preserve">diversidad global</w:t>
+      </w:r>
+      <w:r>
+        <w:rPr>
+          <w:rFonts w:ascii="Times New Roman" w:cs="Times New Roman" w:eastAsia="Times New Roman" w:hAnsi="Times New Roman"/>
+          <w:sz w:val="20"/>
+          <w:szCs w:val="20"/>
+        </w:rPr>
+        <w:t xml:space="preserve"> es esa misma pluralidad a escala mundial, con la que dialogan las culturas locales en un mundo interconectado. </w:t>
       </w:r>
       <w:r>
         <w:rPr>
@@ -225,7 +243,7 @@
           <w:sz w:val="20"/>
           <w:szCs w:val="20"/>
         </w:rPr>
-        <w:t xml:space="preserve">La reforma agraria de 1969 (Decreto Ley 17716) puso fin formal al régimen de hacienda, pero llegó tras décadas de presión campesina, en un país con servicios concentrados en la costa. Antes y sobre todo después de ella se aceleró la migración hacia Lima, impulsada por la falta de tierras, la búsqueda de educación y, en los años ochenta, la violencia política. Matos Mar (1984) llamó “desborde popular” a este proceso: los migrantes levantaron barriadas, comercio y organizaciones propias, y transformaron la ciudad criolla. Esa transformación no fue bien recibida. Muchos migrantes ocultaron el quechua o el aimara, asociados con atraso, para evitar burlas, y sus hijos crecieron hablando solo castellano. Términos como “cholo” o “serrano” funcionaron como marcas de inferioridad (Nugent, 1992; Portocarrero, 2007). Es el mismo estereotipo de la hacienda trasladado a la ciudad. Quijano (2000) lo explica como colonialidad del poder: la idea de “raza” siguió ordenando quién vale más aunque la hacienda desapareciera. De la Cadena (2000) añade que la respetabilidad se construyó alejándose de lo indígena.</w:t>
+        <w:t xml:space="preserve">La reforma agraria de 1969 (Decreto Ley 17716) puso fin formal al régimen de hacienda, pero llegó tras décadas de presión campesina. Antes y sobre todo después de ella se aceleró la migración hacia Lima, impulsada por la falta de tierras, la búsqueda de educación y, en los años ochenta, la violencia política. Matos Mar (1984) llamó “desborde popular” a este proceso: los migrantes levantaron barriadas, comercio y organizaciones propias, y transformaron la ciudad criolla. La migración interna es así la causa directa de la diversidad cultural urbana: la gastronomía, la música, el comercio y las lenguas andinas que hoy definen a Lima llegaron con los migrantes. Sin embargo, esa transformación no fue bien recibida. Muchos migrantes ocultaron el quechua o el aimara, asociados con atraso, para evitar burlas, y sus hijos crecieron hablando solo castellano. Términos como “cholo” o “serrano” funcionaron como marcas de inferioridad (Nugent, 1992; Portocarrero, 2007). Es el mismo estereotipo de la hacienda trasladado a la ciudad. Quijano (2000) lo explica como colonialidad del poder: la “raza” siguió ordenando quién vale más, y la respetabilidad se construyó alejándose de lo indígena (De la Cadena, 2000).</w:t>
       </w:r>
     </w:p>
     <w:p>
@@ -249,7 +267,7 @@
           <w:sz w:val="20"/>
           <w:szCs w:val="20"/>
         </w:rPr>
-        <w:t xml:space="preserve"> El Estado reconoce 48 lenguas originarias y las protege legalmente (Ley 29735, 2011), pero persisten prácticas de exclusión: burlas al acento, avisos laborales que exigen “buena presencia”, desconfianza hacia quien viene de provincia y brechas educativas entre zonas rurales y urbanas. La discriminación ya no se ejerce con látigo ni con hierro candente, como narra el documental, sino con gestos cotidianos e instituciones que dan por “normal” un solo modo de hablar y de ser.</w:t>
+        <w:t xml:space="preserve"> El Estado reconoce 48 lenguas originarias y las protege legalmente (Ley 29735, 2011), pero persisten prácticas de exclusión: burlas al acento, avisos laborales que exigen “buena presencia”, desconfianza hacia quien viene de provincia y brechas educativas entre zonas rurales y urbanas. Ya no hay látigo ni hierro candente, como en el documental, sino gestos cotidianos que dan por “normal” un solo modo de hablar y de ser.</w:t>
       </w:r>
     </w:p>
     <w:p>
@@ -279,7 +297,7 @@
           <w:sz w:val="20"/>
           <w:szCs w:val="20"/>
         </w:rPr>
-        <w:t xml:space="preserve">Creo que hoy convivimos con una contradicción: celebramos la cultura andina como marca de país (gastronomía, danzas, textiles, Machu Picchu), pero desvalorizamos a las personas que la portan. Aplaudimos el folclore en un festival y, a la vez, corregimos el acento de un compañero o dudamos de la capacidad de quien llega de provincia. Negamos la riqueza migrante cuando la tratamos como un déficit que hay que corregir, y la valoramos solo cuando resulta vistosa o rentable. El documental me hizo ver que el mecanismo es el mismo: la jerarquía que antes decía “el indio es inferior” ahora dice “hay que hablar bien y verse bien”. También me dejó una lección sobre la buena voluntad: un exguerrillero admite que fracasaron porque “no conocíamos el país” y los campesinos no los veían como iguales. La inclusión no se decreta desde arriba; requiere escuchar a quienes la viven.</w:t>
+        <w:t xml:space="preserve">Valoro positivamente la migración interna: gracias a ella Lima es una ciudad más diversa, creativa y representativa del país, y la cultura andina enriquece también la diversidad global. Sin embargo, creo que hoy convivimos con una contradicción: celebramos la cultura andina como marca de país (gastronomía, danzas, textiles, Machu Picchu), pero desvalorizamos a las personas que la portan. Aplaudimos el folclore en un festival y, a la vez, corregimos el acento de un compañero o dudamos de la capacidad de quien llega de provincia. Negamos la riqueza migrante cuando la tratamos como un déficit que hay que corregir, y la valoramos solo cuando resulta vistosa o rentable. El documental me hizo ver que el mecanismo es el mismo: la jerarquía que antes decía “el indio es inferior” ahora dice “hay que hablar bien y verse bien”. Además, un exguerrillero admite que fracasaron porque “no conocíamos el país”: la inclusión requiere escuchar a quienes la viven.</w:t>
       </w:r>
     </w:p>
     <w:p>
@@ -319,7 +337,7 @@
           <w:sz w:val="20"/>
           <w:szCs w:val="20"/>
         </w:rPr>
-        <w:t xml:space="preserve"> (a) Ofrecer quechua, aimara y otras lenguas originarias como cursos electivos con créditos y producir materiales bilingües. (b) Crear tutorías entre pares para ingresantes de provincia, con apoyo académico, psicológico y de vivienda, complementando becas como Beca 18. (c) Incorporar saberes andinos y autores regionales en las mallas curriculares. (d) Implementar protocolos de denuncia y sanción de la discriminación étnico-racial.</w:t>
+        <w:t xml:space="preserve"> (a) Ofrecer quechua, aimara y otras lenguas originarias como cursos electivos con créditos y producir materiales bilingües. (b) Crear tutorías entre pares para ingresantes de provincia, con apoyo académico y psicológico, junto a becas como Beca 18. (c) Incorporar saberes andinos y autores regionales en las mallas curriculares. (d) Implementar protocolos de denuncia y sanción de la discriminación étnico-racial.</w:t>
       </w:r>
     </w:p>
     <w:p>
@@ -343,7 +361,7 @@
           <w:sz w:val="20"/>
           <w:szCs w:val="20"/>
         </w:rPr>
-        <w:t xml:space="preserve"> (a) Aplicar selección de personal a ciegas (sin foto, apellido ni lugar de origen) y eliminar la exigencia de “buena presencia”. (b) Capacitar a jefaturas en sesgos y liderazgo intercultural. (c) Valorar el dominio de lenguas originarias como competencia, sobre todo en la atención al público. (d) Habilitar canales de denuncia confidenciales.</w:t>
+        <w:t xml:space="preserve"> (a) Aplicar selección de personal a ciegas (sin foto, apellido ni lugar de origen) y eliminar la exigencia de “buena presencia”. (b) Capacitar a jefaturas en sesgos y liderazgo intercultural. (c) Valorar el dominio de lenguas originarias como competencia, sobre todo en la atención al público.</w:t>
       </w:r>
     </w:p>
     <w:p>
@@ -367,7 +385,7 @@
           <w:sz w:val="20"/>
           <w:szCs w:val="20"/>
         </w:rPr>
-        <w:t xml:space="preserve"> Cumplir la Ley 29735, recopilar datos desagregados por lengua materna y promover contenidos que muestren a los migrantes y sus descendientes como profesionales, líderes y creadores, no solo como personajes cómicos o estereotipados.</w:t>
+        <w:t xml:space="preserve"> Cumplir la Ley 29735 y promover contenidos que muestren a los migrantes y sus descendientes como profesionales, líderes y creadores, no como personajes estereotipados.</w:t>
       </w:r>
     </w:p>
     <w:p>
@@ -407,7 +425,7 @@
           <w:sz w:val="20"/>
           <w:szCs w:val="20"/>
         </w:rPr>
-        <w:t xml:space="preserve"> enseña que la reforma agraria cambió la propiedad de la tierra, pero no eliminó de inmediato las ideas de superioridad que la sostenían. Los migrantes andinos llevaron a Lima su lengua y sus costumbres y enfrentaron un rechazo heredado de la hacienda, que aún se reproduce en aulas y centros de trabajo. Valorar la diversidad exige pasar del elogio folclórico a la equidad efectiva: espacios donde nadie deba ocultar su lengua o su origen para ser respetado. Universidades y empresas tienen la posibilidad de avanzar en ello con medidas concretas.</w:t>
+        <w:t xml:space="preserve"> enseña que la reforma agraria cambió la propiedad de la tierra, pero no eliminó de inmediato las ideas de superioridad que la sostenían. Los migrantes andinos llevaron a Lima su lengua y sus costumbres y enfrentaron un rechazo heredado de la hacienda, que aún se reproduce en aulas y centros de trabajo. Valorar la diversidad exige pasar del elogio folclórico a la equidad efectiva: espacios donde nadie deba ocultar su lengua o su origen para ser respetado.</w:t>
       </w:r>
     </w:p>
     <w:p>

</xml_diff>